<commit_message>
fix(reports): remove all consultant references, fix advisor name to Bektemessov Amanzhol
- Removed 'Domestic scientific consultant' row from signatures table in both reports
- Removed 'Foreign scientific consultant' row from program info table
- Fixed Advisor cell from leftover 'Mustafin Maksat' to correct 'Bektemessov Amanzhol'

Per user clarification: only one supervisor (Bektemessov), no consultants.
</commit_message>
<xml_diff>
--- a/reports/AnnualReport_Zhumakhan_Medet.docx
+++ b/reports/AnnualReport_Zhumakhan_Medet.docx
@@ -1012,73 +1012,6 @@
             <w:r>
               <w:rPr/>
               <w:t xml:space="preserve"> </w:t>
-            </w:r>
-          </w:p>
-        </w:tc>
-      </w:tr>
-      <w:tr>
-        <w:trPr>
-          <w:trHeight w:val="510" w:hRule="atLeast"/>
-        </w:trPr>
-        <w:tc>
-          <w:tcPr>
-            <w:tcW w:w="4785" w:type="dxa"/>
-            <w:tcBorders>
-              <w:start w:val="single" w:sz="6" w:space="0" w:color="000000"/>
-              <w:bottom w:val="single" w:sz="6" w:space="0" w:color="000000"/>
-              <w:end w:val="single" w:sz="6" w:space="0" w:color="000000"/>
-            </w:tcBorders>
-          </w:tcPr>
-          <w:p>
-            <w:pPr>
-              <w:pStyle w:val="Normal"/>
-              <w:rPr/>
-            </w:pPr>
-            <w:r>
-              <w:rPr/>
-              <w:t>Foreign scientific</w:t>
-            </w:r>
-          </w:p>
-          <w:p>
-            <w:pPr>
-              <w:pStyle w:val="Normal"/>
-              <w:rPr>
-                <w:sz w:val="32"/>
-                <w:szCs w:val="32"/>
-              </w:rPr>
-            </w:pPr>
-            <w:r>
-              <w:rPr/>
-              <w:t>consultant</w:t>
-            </w:r>
-          </w:p>
-        </w:tc>
-        <w:tc>
-          <w:tcPr>
-            <w:tcW w:w="4961" w:type="dxa"/>
-            <w:tcBorders>
-              <w:bottom w:val="single" w:sz="6" w:space="0" w:color="000000"/>
-              <w:end w:val="single" w:sz="6" w:space="0" w:color="000000"/>
-            </w:tcBorders>
-          </w:tcPr>
-          <w:p>
-            <w:pPr>
-              <w:pStyle w:val="Normal"/>
-              <w:tabs>
-                <w:tab w:val="clear" w:pos="720"/>
-                <w:tab w:val="left" w:pos="2552" w:leader="none"/>
-              </w:tabs>
-              <w:rPr>
-                <w:b w:val="false"/>
-                <w:bCs w:val="false"/>
-              </w:rPr>
-            </w:pPr>
-            <w:r>
-              <w:rPr>
-                <w:b w:val="false"/>
-                <w:bCs w:val="false"/>
-              </w:rPr>
-              <w:t>Bektemessov Amanzhol</w:t>
             </w:r>
           </w:p>
         </w:tc>
@@ -8670,12 +8603,19 @@
             </w:pPr>
             <w:r>
               <w:rPr>
+                <w:b w:val="0"/>
                 <w:sz w:val="24"/>
                 <w:szCs w:val="24"/>
               </w:rPr>
               <w:t>Advisor</w:t>
             </w:r>
           </w:p>
+        </w:tc>
+        <w:tc>
+          <w:tcPr>
+            <w:tcW w:w="3532" w:type="dxa"/>
+            <w:tcBorders/>
+          </w:tcPr>
           <w:p>
             <w:pPr>
               <w:pStyle w:val="Normal"/>
@@ -8683,25 +8623,24 @@
                 <w:tab w:val="clear" w:pos="720"/>
                 <w:tab w:val="left" w:pos="2552" w:leader="none"/>
               </w:tabs>
-              <w:jc w:val="both"/>
-              <w:rPr>
-                <w:sz w:val="24"/>
-                <w:szCs w:val="24"/>
-              </w:rPr>
-            </w:pPr>
-            <w:r>
-              <w:rPr>
-                <w:sz w:val="24"/>
-                <w:szCs w:val="24"/>
-              </w:rPr>
-            </w:r>
-          </w:p>
-        </w:tc>
-        <w:tc>
-          <w:tcPr>
-            <w:tcW w:w="3532" w:type="dxa"/>
-            <w:tcBorders/>
-          </w:tcPr>
+              <w:jc w:val="center"/>
+              <w:rPr>
+                <w:b w:val="false"/>
+                <w:i/>
+                <w:i/>
+                <w:sz w:val="24"/>
+                <w:szCs w:val="24"/>
+              </w:rPr>
+            </w:pPr>
+            <w:r>
+              <w:rPr>
+                <w:i/>
+                <w:sz w:val="24"/>
+                <w:szCs w:val="24"/>
+              </w:rPr>
+              <w:t>_________________</w:t>
+            </w:r>
+          </w:p>
           <w:p>
             <w:pPr>
               <w:pStyle w:val="Normal"/>
@@ -8711,7 +8650,6 @@
               </w:tabs>
               <w:jc w:val="center"/>
               <w:rPr>
-                <w:b w:val="false"/>
                 <w:i/>
                 <w:i/>
                 <w:sz w:val="24"/>
@@ -8724,9 +8662,15 @@
                 <w:sz w:val="24"/>
                 <w:szCs w:val="24"/>
               </w:rPr>
-              <w:t>_________________</w:t>
-            </w:r>
-          </w:p>
+              <w:t>(sign)</w:t>
+            </w:r>
+          </w:p>
+        </w:tc>
+        <w:tc>
+          <w:tcPr>
+            <w:tcW w:w="3413" w:type="dxa"/>
+            <w:tcBorders/>
+          </w:tcPr>
           <w:p>
             <w:pPr>
               <w:pStyle w:val="Normal"/>
@@ -8734,155 +8678,14 @@
                 <w:tab w:val="clear" w:pos="720"/>
                 <w:tab w:val="left" w:pos="2552" w:leader="none"/>
               </w:tabs>
-              <w:jc w:val="center"/>
-              <w:rPr>
-                <w:i/>
-                <w:i/>
-                <w:sz w:val="24"/>
-                <w:szCs w:val="24"/>
-              </w:rPr>
-            </w:pPr>
-            <w:r>
-              <w:rPr>
-                <w:i/>
-                <w:sz w:val="24"/>
-                <w:szCs w:val="24"/>
-              </w:rPr>
-              <w:t>(sign)</w:t>
-            </w:r>
-          </w:p>
-        </w:tc>
-        <w:tc>
-          <w:tcPr>
-            <w:tcW w:w="3413" w:type="dxa"/>
-            <w:tcBorders/>
-          </w:tcPr>
-          <w:p>
-            <w:pPr>
-              <w:pStyle w:val="Normal"/>
-              <w:tabs>
-                <w:tab w:val="clear" w:pos="720"/>
-                <w:tab w:val="left" w:pos="2552" w:leader="none"/>
-              </w:tabs>
-              <w:rPr>
-                <w:sz w:val="24"/>
-                <w:szCs w:val="24"/>
-              </w:rPr>
-            </w:pPr>
-            <w:r>
-              <w:rPr>
-                <w:sz w:val="24"/>
-                <w:szCs w:val="24"/>
-              </w:rPr>
-              <w:t>Mustafin Maksat</w:t>
-            </w:r>
-          </w:p>
-        </w:tc>
-      </w:tr>
-      <w:tr>
-        <w:trPr/>
-        <w:tc>
-          <w:tcPr>
-            <w:tcW w:w="2694" w:type="dxa"/>
-            <w:tcBorders/>
-          </w:tcPr>
-          <w:p>
-            <w:pPr>
-              <w:pStyle w:val="Normal"/>
-              <w:tabs>
-                <w:tab w:val="clear" w:pos="720"/>
-                <w:tab w:val="left" w:pos="2552" w:leader="none"/>
-              </w:tabs>
-              <w:jc w:val="both"/>
-              <w:rPr>
-                <w:b w:val="false"/>
-                <w:sz w:val="24"/>
-                <w:szCs w:val="24"/>
-              </w:rPr>
-            </w:pPr>
-            <w:r>
-              <w:rPr>
-                <w:sz w:val="24"/>
-                <w:szCs w:val="24"/>
-              </w:rPr>
-              <w:t>Domestic scientific consultant</w:t>
-            </w:r>
-          </w:p>
-        </w:tc>
-        <w:tc>
-          <w:tcPr>
-            <w:tcW w:w="3532" w:type="dxa"/>
-            <w:tcBorders/>
-          </w:tcPr>
-          <w:p>
-            <w:pPr>
-              <w:pStyle w:val="Normal"/>
-              <w:tabs>
-                <w:tab w:val="clear" w:pos="720"/>
-                <w:tab w:val="left" w:pos="2552" w:leader="none"/>
-              </w:tabs>
-              <w:jc w:val="center"/>
-              <w:rPr>
-                <w:b w:val="false"/>
-                <w:i/>
-                <w:i/>
-                <w:sz w:val="24"/>
-                <w:szCs w:val="24"/>
-              </w:rPr>
-            </w:pPr>
-            <w:r>
-              <w:rPr>
-                <w:i/>
-                <w:sz w:val="24"/>
-                <w:szCs w:val="24"/>
-              </w:rPr>
-              <w:t>_________________</w:t>
-            </w:r>
-          </w:p>
-          <w:p>
-            <w:pPr>
-              <w:pStyle w:val="Normal"/>
-              <w:tabs>
-                <w:tab w:val="clear" w:pos="720"/>
-                <w:tab w:val="left" w:pos="2552" w:leader="none"/>
-              </w:tabs>
-              <w:jc w:val="center"/>
-              <w:rPr>
-                <w:i/>
-                <w:i/>
-                <w:sz w:val="24"/>
-                <w:szCs w:val="24"/>
-              </w:rPr>
-            </w:pPr>
-            <w:r>
-              <w:rPr>
-                <w:i/>
-                <w:sz w:val="24"/>
-                <w:szCs w:val="24"/>
-              </w:rPr>
-              <w:t>(sign)</w:t>
-            </w:r>
-          </w:p>
-        </w:tc>
-        <w:tc>
-          <w:tcPr>
-            <w:tcW w:w="3413" w:type="dxa"/>
-            <w:tcBorders/>
-          </w:tcPr>
-          <w:p>
-            <w:pPr>
-              <w:pStyle w:val="Normal"/>
-              <w:tabs>
-                <w:tab w:val="clear" w:pos="720"/>
-                <w:tab w:val="left" w:pos="2552" w:leader="none"/>
-              </w:tabs>
-              <w:rPr>
-                <w:sz w:val="24"/>
-                <w:szCs w:val="24"/>
-              </w:rPr>
-            </w:pPr>
-            <w:r>
-              <w:rPr>
+              <w:rPr>
+                <w:sz w:val="24"/>
+                <w:szCs w:val="24"/>
+              </w:rPr>
+            </w:pPr>
+            <w:r>
+              <w:rPr>
+                <w:b w:val="0"/>
                 <w:sz w:val="24"/>
                 <w:szCs w:val="24"/>
               </w:rPr>

</xml_diff>